<commit_message>
docs: upload today's study updates
</commit_message>
<xml_diff>
--- a/Reinforcement learning/Monte Carlo Estimation.docx
+++ b/Reinforcement learning/Monte Carlo Estimation.docx
@@ -130,10 +130,10 @@
             <v:path o:extrusionok="f" gradientshapeok="t" o:connecttype="rect"/>
             <o:lock v:ext="edit" aspectratio="t"/>
           </v:shapetype>
-          <v:shape id="_x0000_i1042" type="#_x0000_t75" style="width:85.85pt;height:33.8pt" o:ole="">
+          <v:shape id="_x0000_i1025" type="#_x0000_t75" style="width:85.65pt;height:33.7pt" o:ole="">
             <v:imagedata r:id="rId6" o:title=""/>
           </v:shape>
-          <o:OLEObject Type="Embed" ProgID="Equation.DSMT4" ShapeID="_x0000_i1042" DrawAspect="Content" ObjectID="_1837475771" r:id="rId7"/>
+          <o:OLEObject Type="Embed" ProgID="Equation.DSMT4" ShapeID="_x0000_i1025" DrawAspect="Content" ObjectID="_1837496508" r:id="rId7"/>
         </w:object>
       </w:r>
       <w:r>
@@ -308,9 +308,6 @@
     <w:p>
       <w:pPr>
         <w:ind w:firstLineChars="0" w:firstLine="0"/>
-        <w:rPr>
-          <w:rFonts w:hint="eastAsia"/>
-        </w:rPr>
       </w:pPr>
       <w:r>
         <w:rPr>
@@ -366,9 +363,6 @@
     <w:p>
       <w:pPr>
         <w:ind w:firstLineChars="0" w:firstLine="0"/>
-        <w:rPr>
-          <w:rFonts w:hint="eastAsia"/>
-        </w:rPr>
       </w:pPr>
       <w:r>
         <w:rPr>
@@ -470,6 +464,12 @@
           <w:rFonts w:hint="eastAsia"/>
         </w:rPr>
         <w:t>action value</w:t>
+      </w:r>
+      <w:r>
+        <w:rPr>
+          <w:rFonts w:hint="eastAsia"/>
+        </w:rPr>
+        <w:t>。</w:t>
       </w:r>
     </w:p>
     <w:sectPr>
@@ -1217,6 +1217,7 @@
   <w:style w:type="character" w:default="1" w:styleId="a0">
     <w:name w:val="Default Paragraph Font"/>
     <w:uiPriority w:val="1"/>
+    <w:semiHidden/>
     <w:unhideWhenUsed/>
   </w:style>
   <w:style w:type="table" w:default="1" w:styleId="a1">
@@ -1407,6 +1408,7 @@
       <w:numPr>
         <w:ilvl w:val="1"/>
       </w:numPr>
+      <w:ind w:firstLineChars="200" w:firstLine="200"/>
       <w:jc w:val="center"/>
     </w:pPr>
     <w:rPr>

</xml_diff>